<commit_message>
add more auth check
</commit_message>
<xml_diff>
--- a/server/src/templates/card-template.docx
+++ b/server/src/templates/card-template.docx
@@ -543,6 +543,7 @@
         <w:tc>
           <w:tcPr>
             <w:tcW w:w="2094" w:type="dxa"/>
+            <w:gridSpan w:val="2"/>
             <w:tcBorders>
               <w:top w:val="single" w:sz="4" w:space="0" w:color="auto"/>
               <w:left w:val="single" w:sz="4" w:space="0" w:color="auto"/>
@@ -578,46 +579,6 @@
                 <w:szCs w:val="22"/>
               </w:rPr>
               <w:t>Размер:</w:t>
-            </w:r>
-          </w:p>
-        </w:tc>
-        <w:tc>
-          <w:tcPr>
-            <w:tcW w:w="2017" w:type="dxa"/>
-            <w:tcBorders>
-              <w:top w:val="single" w:sz="4" w:space="0" w:color="auto"/>
-              <w:left w:val="single" w:sz="4" w:space="0" w:color="auto"/>
-              <w:bottom w:val="single" w:sz="4" w:space="0" w:color="auto"/>
-              <w:right w:val="single" w:sz="4" w:space="0" w:color="auto"/>
-            </w:tcBorders>
-            <w:tcMar>
-              <w:top w:w="0" w:type="dxa"/>
-              <w:left w:w="108" w:type="dxa"/>
-              <w:bottom w:w="0" w:type="dxa"/>
-              <w:right w:w="108" w:type="dxa"/>
-            </w:tcMar>
-            <w:vAlign w:val="center"/>
-          </w:tcPr>
-          <w:p>
-            <w:pPr>
-              <w:pStyle w:val="Normal"/>
-              <w:widowControl/>
-              <w:suppressAutoHyphens/>
-              <w:spacing w:before="0" w:after="0"/>
-              <w:jc w:val="left"/>
-              <w:rPr>
-                <w:rFonts w:eastAsia="Times New Roman" w:cs="Times New Roman"/>
-                <w:sz w:val="22"/>
-                <w:szCs w:val="22"/>
-              </w:rPr>
-            </w:pPr>
-            <w:r>
-              <w:rPr>
-                <w:rFonts w:eastAsia="Times New Roman" w:cs="Times New Roman"/>
-                <w:kern w:val="0"/>
-                <w:sz w:val="22"/>
-                <w:szCs w:val="22"/>
-              </w:rPr>
             </w:r>
           </w:p>
         </w:tc>
@@ -1779,6 +1740,7 @@
             <w:tcW w:w="10512" w:type="dxa"/>
             <w:gridSpan w:val="5"/>
             <w:tcBorders>
+              <w:top w:val="single" w:sz="2" w:space="0" w:color="000000"/>
               <w:left w:val="single" w:sz="2" w:space="0" w:color="000000"/>
               <w:bottom w:val="single" w:sz="2" w:space="0" w:color="000000"/>
               <w:right w:val="single" w:sz="2" w:space="0" w:color="000000"/>
@@ -1816,6 +1778,7 @@
           <w:tcPr>
             <w:tcW w:w="6360" w:type="dxa"/>
             <w:tcBorders>
+              <w:top w:val="single" w:sz="2" w:space="0" w:color="000000"/>
               <w:left w:val="single" w:sz="2" w:space="0" w:color="000000"/>
               <w:bottom w:val="single" w:sz="2" w:space="0" w:color="000000"/>
               <w:right w:val="single" w:sz="2" w:space="0" w:color="000000"/>
@@ -1853,6 +1816,7 @@
             <w:tcW w:w="1591" w:type="dxa"/>
             <w:gridSpan w:val="2"/>
             <w:tcBorders>
+              <w:top w:val="single" w:sz="2" w:space="0" w:color="000000"/>
               <w:left w:val="single" w:sz="2" w:space="0" w:color="000000"/>
               <w:bottom w:val="single" w:sz="2" w:space="0" w:color="000000"/>
               <w:right w:val="single" w:sz="2" w:space="0" w:color="000000"/>
@@ -1890,6 +1854,7 @@
             <w:tcW w:w="2561" w:type="dxa"/>
             <w:gridSpan w:val="2"/>
             <w:tcBorders>
+              <w:top w:val="single" w:sz="2" w:space="0" w:color="000000"/>
               <w:left w:val="single" w:sz="2" w:space="0" w:color="000000"/>
               <w:bottom w:val="single" w:sz="2" w:space="0" w:color="000000"/>
               <w:right w:val="single" w:sz="2" w:space="0" w:color="000000"/>
@@ -2271,10 +2236,19 @@
         <w:gridCol w:w="3438"/>
       </w:tblGrid>
       <w:tr>
+        <w:trPr>
+          <w:trHeight w:val="300" w:hRule="atLeast"/>
+        </w:trPr>
         <w:tc>
           <w:tcPr>
             <w:tcW w:w="4923" w:type="dxa"/>
             <w:vMerge w:val="restart"/>
+            <w:tcBorders>
+              <w:top w:val="single" w:sz="2" w:space="0" w:color="000000"/>
+              <w:left w:val="single" w:sz="2" w:space="0" w:color="000000"/>
+              <w:bottom w:val="single" w:sz="2" w:space="0" w:color="000000"/>
+              <w:right w:val="single" w:sz="2" w:space="0" w:color="000000"/>
+            </w:tcBorders>
             <w:tcMar>
               <w:top w:w="0" w:type="dxa"/>
               <w:left w:w="28" w:type="dxa"/>
@@ -2329,7 +2303,10 @@
           <w:tcPr>
             <w:tcW w:w="1846" w:type="dxa"/>
             <w:tcBorders>
-              <w:bottom w:val="single" w:sz="2" w:space="0" w:color="000000"/>
+              <w:top w:val="single" w:sz="2" w:space="0" w:color="000000"/>
+              <w:left w:val="single" w:sz="2" w:space="0" w:color="000000"/>
+              <w:bottom w:val="single" w:sz="2" w:space="0" w:color="000000"/>
+              <w:right w:val="single" w:sz="2" w:space="0" w:color="000000"/>
             </w:tcBorders>
             <w:tcMar>
               <w:top w:w="0" w:type="dxa"/>
@@ -2362,6 +2339,12 @@
         <w:tc>
           <w:tcPr>
             <w:tcW w:w="3438" w:type="dxa"/>
+            <w:tcBorders>
+              <w:top w:val="single" w:sz="2" w:space="0" w:color="000000"/>
+              <w:left w:val="single" w:sz="2" w:space="0" w:color="000000"/>
+              <w:bottom w:val="single" w:sz="2" w:space="0" w:color="000000"/>
+              <w:right w:val="single" w:sz="2" w:space="0" w:color="000000"/>
+            </w:tcBorders>
             <w:tcMar>
               <w:top w:w="0" w:type="dxa"/>
               <w:left w:w="28" w:type="dxa"/>
@@ -2398,6 +2381,12 @@
           <w:tcPr>
             <w:tcW w:w="4923" w:type="dxa"/>
             <w:vMerge/>
+            <w:tcBorders>
+              <w:top w:val="single" w:sz="2" w:space="0" w:color="000000"/>
+              <w:left w:val="single" w:sz="2" w:space="0" w:color="000000"/>
+              <w:bottom w:val="single" w:sz="2" w:space="0" w:color="000000"/>
+              <w:right w:val="single" w:sz="2" w:space="0" w:color="000000"/>
+            </w:tcBorders>
             <w:tcMar>
               <w:top w:w="0" w:type="dxa"/>
               <w:left w:w="28" w:type="dxa"/>
@@ -2412,6 +2401,9 @@
             <w:tcW w:w="1846" w:type="dxa"/>
             <w:tcBorders>
               <w:top w:val="single" w:sz="2" w:space="0" w:color="000000"/>
+              <w:left w:val="single" w:sz="2" w:space="0" w:color="000000"/>
+              <w:bottom w:val="single" w:sz="2" w:space="0" w:color="000000"/>
+              <w:right w:val="single" w:sz="2" w:space="0" w:color="000000"/>
             </w:tcBorders>
             <w:tcMar>
               <w:top w:w="0" w:type="dxa"/>
@@ -2444,6 +2436,12 @@
         <w:tc>
           <w:tcPr>
             <w:tcW w:w="3438" w:type="dxa"/>
+            <w:tcBorders>
+              <w:top w:val="single" w:sz="2" w:space="0" w:color="000000"/>
+              <w:left w:val="single" w:sz="2" w:space="0" w:color="000000"/>
+              <w:bottom w:val="single" w:sz="2" w:space="0" w:color="000000"/>
+              <w:right w:val="single" w:sz="2" w:space="0" w:color="000000"/>
+            </w:tcBorders>
             <w:tcMar>
               <w:top w:w="0" w:type="dxa"/>
               <w:left w:w="28" w:type="dxa"/>

</xml_diff>